<commit_message>
add new progress for HW9
</commit_message>
<xml_diff>
--- a/HW9/result/HW9.docx
+++ b/HW9/result/HW9.docx
@@ -1,6 +1,6 @@
 
 <file path=word/document.xml><?xml version="1.0" encoding="utf-8"?>
-<w:document xmlns:wpc="http://schemas.microsoft.com/office/word/2010/wordprocessingCanvas" xmlns:cx="http://schemas.microsoft.com/office/drawing/2014/chartex" xmlns:cx1="http://schemas.microsoft.com/office/drawing/2015/9/8/chartex" xmlns:cx2="http://schemas.microsoft.com/office/drawing/2015/10/21/chartex" xmlns:cx3="http://schemas.microsoft.com/office/drawing/2016/5/9/chartex" xmlns:cx4="http://schemas.microsoft.com/office/drawing/2016/5/10/chartex" xmlns:cx5="http://schemas.microsoft.com/office/drawing/2016/5/11/chartex" xmlns:cx6="http://schemas.microsoft.com/office/drawing/2016/5/12/chartex" xmlns:cx7="http://schemas.microsoft.com/office/drawing/2016/5/13/chartex" xmlns:cx8="http://schemas.microsoft.com/office/drawing/2016/5/14/chartex" xmlns:mc="http://schemas.openxmlformats.org/markup-compatibility/2006" xmlns:aink="http://schemas.microsoft.com/office/drawing/2016/ink" xmlns:am3d="http://schemas.microsoft.com/office/drawing/2017/model3d" xmlns:o="urn:schemas-microsoft-com:office:office" xmlns:r="http://schemas.openxmlformats.org/officeDocument/2006/relationships" xmlns:m="http://schemas.openxmlformats.org/officeDocument/2006/math" xmlns:v="urn:schemas-microsoft-com:vml" xmlns:wp14="http://schemas.microsoft.com/office/word/2010/wordprocessingDrawing" xmlns:wp="http://schemas.openxmlformats.org/drawingml/2006/wordprocessingDrawing" xmlns:w10="urn:schemas-microsoft-com:office:word" xmlns:w="http://schemas.openxmlformats.org/wordprocessingml/2006/main" xmlns:w14="http://schemas.microsoft.com/office/word/2010/wordml" xmlns:w15="http://schemas.microsoft.com/office/word/2012/wordml" xmlns:w16cex="http://schemas.microsoft.com/office/word/2018/wordml/cex" xmlns:w16cid="http://schemas.microsoft.com/office/word/2016/wordml/cid" xmlns:w16="http://schemas.microsoft.com/office/word/2018/wordml" xmlns:w16sdtdh="http://schemas.microsoft.com/office/word/2020/wordml/sdtdatahash" xmlns:w16se="http://schemas.microsoft.com/office/word/2015/wordml/symex" xmlns:wpg="http://schemas.microsoft.com/office/word/2010/wordprocessingGroup" xmlns:wpi="http://schemas.microsoft.com/office/word/2010/wordprocessingInk" xmlns:wne="http://schemas.microsoft.com/office/word/2006/wordml" xmlns:wps="http://schemas.microsoft.com/office/word/2010/wordprocessingShape" mc:Ignorable="w14 w15 w16se w16cid w16 w16cex w16sdtdh wp14">
+<w:document xmlns:wpc="http://schemas.microsoft.com/office/word/2010/wordprocessingCanvas" xmlns:cx="http://schemas.microsoft.com/office/drawing/2014/chartex" xmlns:cx1="http://schemas.microsoft.com/office/drawing/2015/9/8/chartex" xmlns:cx2="http://schemas.microsoft.com/office/drawing/2015/10/21/chartex" xmlns:cx3="http://schemas.microsoft.com/office/drawing/2016/5/9/chartex" xmlns:cx4="http://schemas.microsoft.com/office/drawing/2016/5/10/chartex" xmlns:cx5="http://schemas.microsoft.com/office/drawing/2016/5/11/chartex" xmlns:cx6="http://schemas.microsoft.com/office/drawing/2016/5/12/chartex" xmlns:cx7="http://schemas.microsoft.com/office/drawing/2016/5/13/chartex" xmlns:cx8="http://schemas.microsoft.com/office/drawing/2016/5/14/chartex" xmlns:mc="http://schemas.openxmlformats.org/markup-compatibility/2006" xmlns:aink="http://schemas.microsoft.com/office/drawing/2016/ink" xmlns:am3d="http://schemas.microsoft.com/office/drawing/2017/model3d" xmlns:o="urn:schemas-microsoft-com:office:office" xmlns:oel="http://schemas.microsoft.com/office/2019/extlst" xmlns:r="http://schemas.openxmlformats.org/officeDocument/2006/relationships" xmlns:m="http://schemas.openxmlformats.org/officeDocument/2006/math" xmlns:v="urn:schemas-microsoft-com:vml" xmlns:wp14="http://schemas.microsoft.com/office/word/2010/wordprocessingDrawing" xmlns:wp="http://schemas.openxmlformats.org/drawingml/2006/wordprocessingDrawing" xmlns:w10="urn:schemas-microsoft-com:office:word" xmlns:w="http://schemas.openxmlformats.org/wordprocessingml/2006/main" xmlns:w14="http://schemas.microsoft.com/office/word/2010/wordml" xmlns:w15="http://schemas.microsoft.com/office/word/2012/wordml" xmlns:w16cex="http://schemas.microsoft.com/office/word/2018/wordml/cex" xmlns:w16cid="http://schemas.microsoft.com/office/word/2016/wordml/cid" xmlns:w16="http://schemas.microsoft.com/office/word/2018/wordml" xmlns:w16du="http://schemas.microsoft.com/office/word/2023/wordml/word16du" xmlns:w16sdtdh="http://schemas.microsoft.com/office/word/2020/wordml/sdtdatahash" xmlns:w16sdtfl="http://schemas.microsoft.com/office/word/2024/wordml/sdtformatlock" xmlns:w16se="http://schemas.microsoft.com/office/word/2015/wordml/symex" xmlns:wpg="http://schemas.microsoft.com/office/word/2010/wordprocessingGroup" xmlns:wpi="http://schemas.microsoft.com/office/word/2010/wordprocessingInk" xmlns:wne="http://schemas.microsoft.com/office/word/2006/wordml" xmlns:wps="http://schemas.microsoft.com/office/word/2010/wordprocessingShape" mc:Ignorable="w14 w15 w16se w16cid w16 w16cex w16sdtdh w16sdtfl w16du wp14">
   <w:body>
     <w:p>
       <w:pPr>
@@ -51,66 +51,78 @@
     </w:p>
     <w:p>
       <w:pPr>
-        <w:ind w:firstLine="720"/>
-        <w:rPr>
-          <w:b/>
-          <w:bCs/>
-          <w:sz w:val="24"/>
-          <w:szCs w:val="32"/>
-        </w:rPr>
-      </w:pPr>
-      <w:r>
-        <w:rPr>
-          <w:b/>
-          <w:bCs/>
-          <w:sz w:val="24"/>
-          <w:szCs w:val="32"/>
-        </w:rPr>
-        <w:t xml:space="preserve">• Formulate the model where these changes in prices affect both sales and purchases of corn and wheat. Assume sugar beet prices are not affected by yields. </w:t>
+        <w:pStyle w:val="ListParagraph"/>
+        <w:numPr>
+          <w:ilvl w:val="0"/>
+          <w:numId w:val="2"/>
+        </w:numPr>
+        <w:rPr>
+          <w:b/>
+          <w:bCs/>
+          <w:sz w:val="24"/>
+          <w:szCs w:val="32"/>
+        </w:rPr>
+      </w:pPr>
+      <w:r>
+        <w:rPr>
+          <w:b/>
+          <w:bCs/>
+          <w:sz w:val="24"/>
+          <w:szCs w:val="32"/>
+        </w:rPr>
+        <w:t xml:space="preserve">Formulate the model where these changes in prices affect both sales and purchases of corn and wheat. Assume sugar beet prices are not affected by yields. </w:t>
       </w:r>
     </w:p>
     <w:p>
       <w:pPr>
         <w:rPr>
-          <w:sz w:val="24"/>
-          <w:szCs w:val="32"/>
-        </w:rPr>
-      </w:pPr>
-      <w:r>
-        <w:rPr>
-          <w:sz w:val="24"/>
-          <w:szCs w:val="32"/>
-        </w:rPr>
-        <w:t>-</w:t>
+          <w:b/>
+          <w:bCs/>
+          <w:i/>
+          <w:iCs/>
+          <w:color w:val="002060"/>
+          <w:sz w:val="24"/>
+          <w:szCs w:val="32"/>
+        </w:rPr>
+      </w:pPr>
+      <w:r>
+        <w:rPr>
+          <w:b/>
+          <w:bCs/>
+          <w:i/>
+          <w:iCs/>
+          <w:color w:val="002060"/>
+          <w:sz w:val="24"/>
+          <w:szCs w:val="32"/>
+        </w:rPr>
+        <w:t xml:space="preserve">Decision variable </w:t>
       </w:r>
     </w:p>
     <w:p>
       <w:pPr>
-        <w:ind w:firstLine="720"/>
-        <w:rPr>
-          <w:b/>
-          <w:bCs/>
-          <w:sz w:val="24"/>
-          <w:szCs w:val="32"/>
-        </w:rPr>
-      </w:pPr>
-      <w:r>
-        <w:rPr>
-          <w:b/>
-          <w:bCs/>
-          <w:sz w:val="24"/>
-          <w:szCs w:val="32"/>
-        </w:rPr>
-        <w:t>• Solve this model</w:t>
-      </w:r>
-    </w:p>
-    <w:p>
-      <w:r>
+        <w:rPr>
+          <w:b/>
+          <w:bCs/>
+          <w:color w:val="002060"/>
+          <w:sz w:val="24"/>
+          <w:szCs w:val="32"/>
+        </w:rPr>
+      </w:pPr>
+      <w:r>
+        <w:rPr>
+          <w:noProof/>
+        </w:rPr>
+        <w:t xml:space="preserve"> </w:t>
+      </w:r>
+      <w:r>
+        <w:rPr>
+          <w:noProof/>
+        </w:rPr>
         <w:drawing>
-          <wp:inline distT="0" distB="0" distL="0" distR="0" wp14:anchorId="58DCBACA" wp14:editId="58194ABE">
-            <wp:extent cx="5943600" cy="2605405"/>
-            <wp:effectExtent l="19050" t="19050" r="19050" b="23495"/>
-            <wp:docPr id="1" name="Picture 1"/>
+          <wp:inline distT="0" distB="0" distL="0" distR="0" wp14:anchorId="609A4EEC" wp14:editId="4D5FE051">
+            <wp:extent cx="2763907" cy="2954765"/>
+            <wp:effectExtent l="19050" t="19050" r="17780" b="17145"/>
+            <wp:docPr id="368406878" name="Picture 1"/>
             <wp:cNvGraphicFramePr>
               <a:graphicFrameLocks xmlns:a="http://schemas.openxmlformats.org/drawingml/2006/main" noChangeAspect="1"/>
             </wp:cNvGraphicFramePr>
@@ -118,11 +130,11 @@
               <a:graphicData uri="http://schemas.openxmlformats.org/drawingml/2006/picture">
                 <pic:pic xmlns:pic="http://schemas.openxmlformats.org/drawingml/2006/picture">
                   <pic:nvPicPr>
-                    <pic:cNvPr id="1" name=""/>
+                    <pic:cNvPr id="368406878" name=""/>
                     <pic:cNvPicPr/>
                   </pic:nvPicPr>
                   <pic:blipFill>
-                    <a:blip r:embed="rId5"/>
+                    <a:blip r:embed="rId6"/>
                     <a:stretch>
                       <a:fillRect/>
                     </a:stretch>
@@ -130,7 +142,7 @@
                   <pic:spPr>
                     <a:xfrm>
                       <a:off x="0" y="0"/>
-                      <a:ext cx="5943600" cy="2605405"/>
+                      <a:ext cx="2780867" cy="2972897"/>
                     </a:xfrm>
                     <a:prstGeom prst="rect">
                       <a:avLst/>
@@ -149,7 +161,243 @@
       </w:r>
     </w:p>
     <w:p>
-      <w:r>
+      <w:pPr>
+        <w:rPr>
+          <w:b/>
+          <w:bCs/>
+          <w:i/>
+          <w:iCs/>
+          <w:color w:val="002060"/>
+          <w:sz w:val="24"/>
+          <w:szCs w:val="32"/>
+        </w:rPr>
+      </w:pPr>
+      <w:r>
+        <w:rPr>
+          <w:b/>
+          <w:bCs/>
+          <w:i/>
+          <w:iCs/>
+          <w:color w:val="002060"/>
+          <w:sz w:val="24"/>
+          <w:szCs w:val="32"/>
+        </w:rPr>
+        <w:t xml:space="preserve">Objective function </w:t>
+      </w:r>
+    </w:p>
+    <w:p>
+      <w:pPr>
+        <w:rPr>
+          <w:b/>
+          <w:bCs/>
+          <w:color w:val="002060"/>
+          <w:sz w:val="24"/>
+          <w:szCs w:val="32"/>
+        </w:rPr>
+      </w:pPr>
+      <w:r>
+        <w:rPr>
+          <w:b/>
+          <w:bCs/>
+          <w:color w:val="002060"/>
+          <w:sz w:val="24"/>
+          <w:szCs w:val="32"/>
+        </w:rPr>
+        <w:drawing>
+          <wp:inline distT="0" distB="0" distL="0" distR="0" wp14:anchorId="2E1D56DE" wp14:editId="1B51B57E">
+            <wp:extent cx="5943600" cy="2764155"/>
+            <wp:effectExtent l="19050" t="19050" r="19050" b="17145"/>
+            <wp:docPr id="204173011" name="Picture 1"/>
+            <wp:cNvGraphicFramePr>
+              <a:graphicFrameLocks xmlns:a="http://schemas.openxmlformats.org/drawingml/2006/main" noChangeAspect="1"/>
+            </wp:cNvGraphicFramePr>
+            <a:graphic xmlns:a="http://schemas.openxmlformats.org/drawingml/2006/main">
+              <a:graphicData uri="http://schemas.openxmlformats.org/drawingml/2006/picture">
+                <pic:pic xmlns:pic="http://schemas.openxmlformats.org/drawingml/2006/picture">
+                  <pic:nvPicPr>
+                    <pic:cNvPr id="204173011" name=""/>
+                    <pic:cNvPicPr/>
+                  </pic:nvPicPr>
+                  <pic:blipFill>
+                    <a:blip r:embed="rId7"/>
+                    <a:stretch>
+                      <a:fillRect/>
+                    </a:stretch>
+                  </pic:blipFill>
+                  <pic:spPr>
+                    <a:xfrm>
+                      <a:off x="0" y="0"/>
+                      <a:ext cx="5943600" cy="2764155"/>
+                    </a:xfrm>
+                    <a:prstGeom prst="rect">
+                      <a:avLst/>
+                    </a:prstGeom>
+                    <a:ln w="3175">
+                      <a:solidFill>
+                        <a:schemeClr val="tx1"/>
+                      </a:solidFill>
+                    </a:ln>
+                  </pic:spPr>
+                </pic:pic>
+              </a:graphicData>
+            </a:graphic>
+          </wp:inline>
+        </w:drawing>
+      </w:r>
+    </w:p>
+    <w:p>
+      <w:pPr>
+        <w:rPr>
+          <w:b/>
+          <w:bCs/>
+          <w:i/>
+          <w:iCs/>
+          <w:color w:val="002060"/>
+          <w:sz w:val="24"/>
+          <w:szCs w:val="32"/>
+        </w:rPr>
+      </w:pPr>
+      <w:r>
+        <w:rPr>
+          <w:b/>
+          <w:bCs/>
+          <w:i/>
+          <w:iCs/>
+          <w:color w:val="002060"/>
+          <w:sz w:val="24"/>
+          <w:szCs w:val="32"/>
+        </w:rPr>
+        <w:lastRenderedPageBreak/>
+        <w:t>Constraint</w:t>
+      </w:r>
+    </w:p>
+    <w:p>
+      <w:pPr>
+        <w:rPr>
+          <w:sz w:val="24"/>
+          <w:szCs w:val="32"/>
+        </w:rPr>
+      </w:pPr>
+      <w:r>
+        <w:rPr>
+          <w:sz w:val="24"/>
+          <w:szCs w:val="32"/>
+        </w:rPr>
+        <w:drawing>
+          <wp:inline distT="0" distB="0" distL="0" distR="0" wp14:anchorId="46A19788" wp14:editId="0AAE6BD1">
+            <wp:extent cx="5943600" cy="1040765"/>
+            <wp:effectExtent l="19050" t="19050" r="19050" b="26035"/>
+            <wp:docPr id="55239015" name="Picture 1"/>
+            <wp:cNvGraphicFramePr>
+              <a:graphicFrameLocks xmlns:a="http://schemas.openxmlformats.org/drawingml/2006/main" noChangeAspect="1"/>
+            </wp:cNvGraphicFramePr>
+            <a:graphic xmlns:a="http://schemas.openxmlformats.org/drawingml/2006/main">
+              <a:graphicData uri="http://schemas.openxmlformats.org/drawingml/2006/picture">
+                <pic:pic xmlns:pic="http://schemas.openxmlformats.org/drawingml/2006/picture">
+                  <pic:nvPicPr>
+                    <pic:cNvPr id="55239015" name=""/>
+                    <pic:cNvPicPr/>
+                  </pic:nvPicPr>
+                  <pic:blipFill>
+                    <a:blip r:embed="rId8"/>
+                    <a:stretch>
+                      <a:fillRect/>
+                    </a:stretch>
+                  </pic:blipFill>
+                  <pic:spPr>
+                    <a:xfrm>
+                      <a:off x="0" y="0"/>
+                      <a:ext cx="5943600" cy="1040765"/>
+                    </a:xfrm>
+                    <a:prstGeom prst="rect">
+                      <a:avLst/>
+                    </a:prstGeom>
+                    <a:ln w="3175">
+                      <a:solidFill>
+                        <a:schemeClr val="tx1"/>
+                      </a:solidFill>
+                    </a:ln>
+                  </pic:spPr>
+                </pic:pic>
+              </a:graphicData>
+            </a:graphic>
+          </wp:inline>
+        </w:drawing>
+      </w:r>
+    </w:p>
+    <w:p>
+      <w:pPr>
+        <w:pStyle w:val="ListParagraph"/>
+        <w:numPr>
+          <w:ilvl w:val="0"/>
+          <w:numId w:val="2"/>
+        </w:numPr>
+        <w:rPr>
+          <w:b/>
+          <w:bCs/>
+          <w:sz w:val="24"/>
+          <w:szCs w:val="32"/>
+        </w:rPr>
+      </w:pPr>
+      <w:r>
+        <w:rPr>
+          <w:b/>
+          <w:bCs/>
+          <w:sz w:val="24"/>
+          <w:szCs w:val="32"/>
+        </w:rPr>
+        <w:t>Solve this model</w:t>
+      </w:r>
+    </w:p>
+    <w:p>
+      <w:r>
+        <w:drawing>
+          <wp:inline distT="0" distB="0" distL="0" distR="0" wp14:anchorId="4901091F" wp14:editId="44B79188">
+            <wp:extent cx="5943600" cy="2501265"/>
+            <wp:effectExtent l="19050" t="19050" r="19050" b="13335"/>
+            <wp:docPr id="772289614" name="Picture 1"/>
+            <wp:cNvGraphicFramePr>
+              <a:graphicFrameLocks xmlns:a="http://schemas.openxmlformats.org/drawingml/2006/main" noChangeAspect="1"/>
+            </wp:cNvGraphicFramePr>
+            <a:graphic xmlns:a="http://schemas.openxmlformats.org/drawingml/2006/main">
+              <a:graphicData uri="http://schemas.openxmlformats.org/drawingml/2006/picture">
+                <pic:pic xmlns:pic="http://schemas.openxmlformats.org/drawingml/2006/picture">
+                  <pic:nvPicPr>
+                    <pic:cNvPr id="772289614" name=""/>
+                    <pic:cNvPicPr/>
+                  </pic:nvPicPr>
+                  <pic:blipFill>
+                    <a:blip r:embed="rId9"/>
+                    <a:stretch>
+                      <a:fillRect/>
+                    </a:stretch>
+                  </pic:blipFill>
+                  <pic:spPr>
+                    <a:xfrm>
+                      <a:off x="0" y="0"/>
+                      <a:ext cx="5943600" cy="2501265"/>
+                    </a:xfrm>
+                    <a:prstGeom prst="rect">
+                      <a:avLst/>
+                    </a:prstGeom>
+                    <a:ln w="3175">
+                      <a:solidFill>
+                        <a:schemeClr val="tx1"/>
+                      </a:solidFill>
+                    </a:ln>
+                  </pic:spPr>
+                </pic:pic>
+              </a:graphicData>
+            </a:graphic>
+          </wp:inline>
+        </w:drawing>
+      </w:r>
+    </w:p>
+    <w:p>
+      <w:r>
+        <w:rPr>
+          <w:noProof/>
+        </w:rPr>
         <w:drawing>
           <wp:inline distT="0" distB="0" distL="0" distR="0" wp14:anchorId="5AAC6D47" wp14:editId="364732B5">
             <wp:extent cx="5943600" cy="2736772"/>
@@ -166,7 +414,7 @@
                     <pic:cNvPicPr/>
                   </pic:nvPicPr>
                   <pic:blipFill>
-                    <a:blip r:embed="rId6"/>
+                    <a:blip r:embed="rId10"/>
                     <a:stretch>
                       <a:fillRect/>
                     </a:stretch>
@@ -193,6 +441,8 @@
       </w:r>
     </w:p>
     <w:p/>
+    <w:p/>
+    <w:p/>
     <w:p>
       <w:r>
         <w:rPr>
@@ -207,6 +457,9 @@
     </w:p>
     <w:p>
       <w:r>
+        <w:rPr>
+          <w:noProof/>
+        </w:rPr>
         <w:drawing>
           <wp:inline distT="0" distB="0" distL="0" distR="0" wp14:anchorId="4F7A19F1" wp14:editId="500F9668">
             <wp:extent cx="5363323" cy="5601482"/>
@@ -223,7 +476,7 @@
                     <pic:cNvPicPr/>
                   </pic:nvPicPr>
                   <pic:blipFill>
-                    <a:blip r:embed="rId7"/>
+                    <a:blip r:embed="rId11"/>
                     <a:stretch>
                       <a:fillRect/>
                     </a:stretch>
@@ -259,8 +512,191 @@
 </w:document>
 </file>
 
+<file path=word/numbering.xml><?xml version="1.0" encoding="utf-8"?>
+<w:numbering xmlns:wpc="http://schemas.microsoft.com/office/word/2010/wordprocessingCanvas" xmlns:cx="http://schemas.microsoft.com/office/drawing/2014/chartex" xmlns:cx1="http://schemas.microsoft.com/office/drawing/2015/9/8/chartex" xmlns:cx2="http://schemas.microsoft.com/office/drawing/2015/10/21/chartex" xmlns:cx3="http://schemas.microsoft.com/office/drawing/2016/5/9/chartex" xmlns:cx4="http://schemas.microsoft.com/office/drawing/2016/5/10/chartex" xmlns:cx5="http://schemas.microsoft.com/office/drawing/2016/5/11/chartex" xmlns:cx6="http://schemas.microsoft.com/office/drawing/2016/5/12/chartex" xmlns:cx7="http://schemas.microsoft.com/office/drawing/2016/5/13/chartex" xmlns:cx8="http://schemas.microsoft.com/office/drawing/2016/5/14/chartex" xmlns:mc="http://schemas.openxmlformats.org/markup-compatibility/2006" xmlns:aink="http://schemas.microsoft.com/office/drawing/2016/ink" xmlns:am3d="http://schemas.microsoft.com/office/drawing/2017/model3d" xmlns:o="urn:schemas-microsoft-com:office:office" xmlns:oel="http://schemas.microsoft.com/office/2019/extlst" xmlns:r="http://schemas.openxmlformats.org/officeDocument/2006/relationships" xmlns:m="http://schemas.openxmlformats.org/officeDocument/2006/math" xmlns:v="urn:schemas-microsoft-com:vml" xmlns:wp14="http://schemas.microsoft.com/office/word/2010/wordprocessingDrawing" xmlns:wp="http://schemas.openxmlformats.org/drawingml/2006/wordprocessingDrawing" xmlns:w10="urn:schemas-microsoft-com:office:word" xmlns:w="http://schemas.openxmlformats.org/wordprocessingml/2006/main" xmlns:w14="http://schemas.microsoft.com/office/word/2010/wordml" xmlns:w15="http://schemas.microsoft.com/office/word/2012/wordml" xmlns:w16cex="http://schemas.microsoft.com/office/word/2018/wordml/cex" xmlns:w16cid="http://schemas.microsoft.com/office/word/2016/wordml/cid" xmlns:w16="http://schemas.microsoft.com/office/word/2018/wordml" xmlns:w16du="http://schemas.microsoft.com/office/word/2023/wordml/word16du" xmlns:w16sdtdh="http://schemas.microsoft.com/office/word/2020/wordml/sdtdatahash" xmlns:w16sdtfl="http://schemas.microsoft.com/office/word/2024/wordml/sdtformatlock" xmlns:w16se="http://schemas.microsoft.com/office/word/2015/wordml/symex" xmlns:wpg="http://schemas.microsoft.com/office/word/2010/wordprocessingGroup" xmlns:wpi="http://schemas.microsoft.com/office/word/2010/wordprocessingInk" xmlns:wne="http://schemas.microsoft.com/office/word/2006/wordml" xmlns:wps="http://schemas.microsoft.com/office/word/2010/wordprocessingShape" mc:Ignorable="w14 w15 w16se w16cid w16 w16cex w16sdtdh w16sdtfl w16du wp14">
+  <w:abstractNum w:abstractNumId="0" w15:restartNumberingAfterBreak="0">
+    <w:nsid w:val="1D1E41A0"/>
+    <w:multiLevelType w:val="hybridMultilevel"/>
+    <w:tmpl w:val="03787024"/>
+    <w:lvl w:ilvl="0" w:tplc="0409000F">
+      <w:start w:val="1"/>
+      <w:numFmt w:val="decimal"/>
+      <w:lvlText w:val="%1."/>
+      <w:lvlJc w:val="left"/>
+      <w:pPr>
+        <w:ind w:left="720" w:hanging="360"/>
+      </w:pPr>
+    </w:lvl>
+    <w:lvl w:ilvl="1" w:tplc="04090019" w:tentative="1">
+      <w:start w:val="1"/>
+      <w:numFmt w:val="lowerLetter"/>
+      <w:lvlText w:val="%2."/>
+      <w:lvlJc w:val="left"/>
+      <w:pPr>
+        <w:ind w:left="1440" w:hanging="360"/>
+      </w:pPr>
+    </w:lvl>
+    <w:lvl w:ilvl="2" w:tplc="0409001B" w:tentative="1">
+      <w:start w:val="1"/>
+      <w:numFmt w:val="lowerRoman"/>
+      <w:lvlText w:val="%3."/>
+      <w:lvlJc w:val="right"/>
+      <w:pPr>
+        <w:ind w:left="2160" w:hanging="180"/>
+      </w:pPr>
+    </w:lvl>
+    <w:lvl w:ilvl="3" w:tplc="0409000F" w:tentative="1">
+      <w:start w:val="1"/>
+      <w:numFmt w:val="decimal"/>
+      <w:lvlText w:val="%4."/>
+      <w:lvlJc w:val="left"/>
+      <w:pPr>
+        <w:ind w:left="2880" w:hanging="360"/>
+      </w:pPr>
+    </w:lvl>
+    <w:lvl w:ilvl="4" w:tplc="04090019" w:tentative="1">
+      <w:start w:val="1"/>
+      <w:numFmt w:val="lowerLetter"/>
+      <w:lvlText w:val="%5."/>
+      <w:lvlJc w:val="left"/>
+      <w:pPr>
+        <w:ind w:left="3600" w:hanging="360"/>
+      </w:pPr>
+    </w:lvl>
+    <w:lvl w:ilvl="5" w:tplc="0409001B" w:tentative="1">
+      <w:start w:val="1"/>
+      <w:numFmt w:val="lowerRoman"/>
+      <w:lvlText w:val="%6."/>
+      <w:lvlJc w:val="right"/>
+      <w:pPr>
+        <w:ind w:left="4320" w:hanging="180"/>
+      </w:pPr>
+    </w:lvl>
+    <w:lvl w:ilvl="6" w:tplc="0409000F" w:tentative="1">
+      <w:start w:val="1"/>
+      <w:numFmt w:val="decimal"/>
+      <w:lvlText w:val="%7."/>
+      <w:lvlJc w:val="left"/>
+      <w:pPr>
+        <w:ind w:left="5040" w:hanging="360"/>
+      </w:pPr>
+    </w:lvl>
+    <w:lvl w:ilvl="7" w:tplc="04090019" w:tentative="1">
+      <w:start w:val="1"/>
+      <w:numFmt w:val="lowerLetter"/>
+      <w:lvlText w:val="%8."/>
+      <w:lvlJc w:val="left"/>
+      <w:pPr>
+        <w:ind w:left="5760" w:hanging="360"/>
+      </w:pPr>
+    </w:lvl>
+    <w:lvl w:ilvl="8" w:tplc="0409001B" w:tentative="1">
+      <w:start w:val="1"/>
+      <w:numFmt w:val="lowerRoman"/>
+      <w:lvlText w:val="%9."/>
+      <w:lvlJc w:val="right"/>
+      <w:pPr>
+        <w:ind w:left="6480" w:hanging="180"/>
+      </w:pPr>
+    </w:lvl>
+  </w:abstractNum>
+  <w:abstractNum w:abstractNumId="1" w15:restartNumberingAfterBreak="0">
+    <w:nsid w:val="7CD53CE5"/>
+    <w:multiLevelType w:val="hybridMultilevel"/>
+    <w:tmpl w:val="AEA46C98"/>
+    <w:lvl w:ilvl="0" w:tplc="0409000F">
+      <w:start w:val="1"/>
+      <w:numFmt w:val="decimal"/>
+      <w:lvlText w:val="%1."/>
+      <w:lvlJc w:val="left"/>
+      <w:pPr>
+        <w:ind w:left="720" w:hanging="360"/>
+      </w:pPr>
+    </w:lvl>
+    <w:lvl w:ilvl="1" w:tplc="04090019" w:tentative="1">
+      <w:start w:val="1"/>
+      <w:numFmt w:val="lowerLetter"/>
+      <w:lvlText w:val="%2."/>
+      <w:lvlJc w:val="left"/>
+      <w:pPr>
+        <w:ind w:left="1440" w:hanging="360"/>
+      </w:pPr>
+    </w:lvl>
+    <w:lvl w:ilvl="2" w:tplc="0409001B" w:tentative="1">
+      <w:start w:val="1"/>
+      <w:numFmt w:val="lowerRoman"/>
+      <w:lvlText w:val="%3."/>
+      <w:lvlJc w:val="right"/>
+      <w:pPr>
+        <w:ind w:left="2160" w:hanging="180"/>
+      </w:pPr>
+    </w:lvl>
+    <w:lvl w:ilvl="3" w:tplc="0409000F" w:tentative="1">
+      <w:start w:val="1"/>
+      <w:numFmt w:val="decimal"/>
+      <w:lvlText w:val="%4."/>
+      <w:lvlJc w:val="left"/>
+      <w:pPr>
+        <w:ind w:left="2880" w:hanging="360"/>
+      </w:pPr>
+    </w:lvl>
+    <w:lvl w:ilvl="4" w:tplc="04090019" w:tentative="1">
+      <w:start w:val="1"/>
+      <w:numFmt w:val="lowerLetter"/>
+      <w:lvlText w:val="%5."/>
+      <w:lvlJc w:val="left"/>
+      <w:pPr>
+        <w:ind w:left="3600" w:hanging="360"/>
+      </w:pPr>
+    </w:lvl>
+    <w:lvl w:ilvl="5" w:tplc="0409001B" w:tentative="1">
+      <w:start w:val="1"/>
+      <w:numFmt w:val="lowerRoman"/>
+      <w:lvlText w:val="%6."/>
+      <w:lvlJc w:val="right"/>
+      <w:pPr>
+        <w:ind w:left="4320" w:hanging="180"/>
+      </w:pPr>
+    </w:lvl>
+    <w:lvl w:ilvl="6" w:tplc="0409000F" w:tentative="1">
+      <w:start w:val="1"/>
+      <w:numFmt w:val="decimal"/>
+      <w:lvlText w:val="%7."/>
+      <w:lvlJc w:val="left"/>
+      <w:pPr>
+        <w:ind w:left="5040" w:hanging="360"/>
+      </w:pPr>
+    </w:lvl>
+    <w:lvl w:ilvl="7" w:tplc="04090019" w:tentative="1">
+      <w:start w:val="1"/>
+      <w:numFmt w:val="lowerLetter"/>
+      <w:lvlText w:val="%8."/>
+      <w:lvlJc w:val="left"/>
+      <w:pPr>
+        <w:ind w:left="5760" w:hanging="360"/>
+      </w:pPr>
+    </w:lvl>
+    <w:lvl w:ilvl="8" w:tplc="0409001B" w:tentative="1">
+      <w:start w:val="1"/>
+      <w:numFmt w:val="lowerRoman"/>
+      <w:lvlText w:val="%9."/>
+      <w:lvlJc w:val="right"/>
+      <w:pPr>
+        <w:ind w:left="6480" w:hanging="180"/>
+      </w:pPr>
+    </w:lvl>
+  </w:abstractNum>
+  <w:num w:numId="1" w16cid:durableId="1539077430">
+    <w:abstractNumId w:val="1"/>
+  </w:num>
+  <w:num w:numId="2" w16cid:durableId="1638412331">
+    <w:abstractNumId w:val="0"/>
+  </w:num>
+</w:numbering>
+</file>
+
 <file path=word/styles.xml><?xml version="1.0" encoding="utf-8"?>
-<w:styles xmlns:mc="http://schemas.openxmlformats.org/markup-compatibility/2006" xmlns:r="http://schemas.openxmlformats.org/officeDocument/2006/relationships" xmlns:w="http://schemas.openxmlformats.org/wordprocessingml/2006/main" xmlns:w14="http://schemas.microsoft.com/office/word/2010/wordml" xmlns:w15="http://schemas.microsoft.com/office/word/2012/wordml" xmlns:w16cex="http://schemas.microsoft.com/office/word/2018/wordml/cex" xmlns:w16cid="http://schemas.microsoft.com/office/word/2016/wordml/cid" xmlns:w16="http://schemas.microsoft.com/office/word/2018/wordml" xmlns:w16sdtdh="http://schemas.microsoft.com/office/word/2020/wordml/sdtdatahash" xmlns:w16se="http://schemas.microsoft.com/office/word/2015/wordml/symex" mc:Ignorable="w14 w15 w16se w16cid w16 w16cex w16sdtdh">
+<w:styles xmlns:mc="http://schemas.openxmlformats.org/markup-compatibility/2006" xmlns:r="http://schemas.openxmlformats.org/officeDocument/2006/relationships" xmlns:w="http://schemas.openxmlformats.org/wordprocessingml/2006/main" xmlns:w14="http://schemas.microsoft.com/office/word/2010/wordml" xmlns:w15="http://schemas.microsoft.com/office/word/2012/wordml" xmlns:w16cex="http://schemas.microsoft.com/office/word/2018/wordml/cex" xmlns:w16cid="http://schemas.microsoft.com/office/word/2016/wordml/cid" xmlns:w16="http://schemas.microsoft.com/office/word/2018/wordml" xmlns:w16du="http://schemas.microsoft.com/office/word/2023/wordml/word16du" xmlns:w16sdtdh="http://schemas.microsoft.com/office/word/2020/wordml/sdtdatahash" xmlns:w16sdtfl="http://schemas.microsoft.com/office/word/2024/wordml/sdtformatlock" xmlns:w16se="http://schemas.microsoft.com/office/word/2015/wordml/symex" mc:Ignorable="w14 w15 w16se w16cid w16 w16cex w16sdtdh w16sdtfl w16du">
   <w:docDefaults>
     <w:rPrDefault>
       <w:rPr>
@@ -719,6 +1155,17 @@
       <w:szCs w:val="40"/>
     </w:rPr>
   </w:style>
+  <w:style w:type="paragraph" w:styleId="ListParagraph">
+    <w:name w:val="List Paragraph"/>
+    <w:basedOn w:val="Normal"/>
+    <w:uiPriority w:val="34"/>
+    <w:qFormat/>
+    <w:rsid w:val="00E57D61"/>
+    <w:pPr>
+      <w:ind w:left="720"/>
+      <w:contextualSpacing/>
+    </w:pPr>
+  </w:style>
 </w:styles>
 </file>
 

</xml_diff>